<commit_message>
equation typo in table
</commit_message>
<xml_diff>
--- a/docs/chapter_downloads/Quintana_GoFish_Metabolism.docx
+++ b/docs/chapter_downloads/Quintana_GoFish_Metabolism.docx
@@ -1396,7 +1396,7 @@
               <w:jc w:val="center"/>
             </w:pPr>
             <w:r>
-              <w:t xml:space="preserve">Met-base times movement ratio</w:t>
+              <w:t xml:space="preserve">Met-base * movement ratio</w:t>
             </w:r>
           </w:p>
         </w:tc>
@@ -1434,7 +1434,7 @@
               <w:jc w:val="center"/>
             </w:pPr>
             <w:r>
-              <w:t xml:space="preserve">Met-base times 0.02</w:t>
+              <w:t xml:space="preserve">Met-base * 0.02</w:t>
             </w:r>
           </w:p>
         </w:tc>
@@ -1472,7 +1472,7 @@
               <w:jc w:val="center"/>
             </w:pPr>
             <w:r>
-              <w:t xml:space="preserve">Met-base times 0.05</w:t>
+              <w:t xml:space="preserve">Met-base * 0.05</w:t>
             </w:r>
           </w:p>
         </w:tc>

</xml_diff>